<commit_message>
docs(legal): regenerate counsel-pack screenshots against the current UI
All four screenshots dated to 2026-05-21 and predated the consent changes (marketing-opt-in removal, submission-as-consent, opening-copy tweak). Recaptured against the live app at the real 420px embed-panel width:
- 01 opening screen: current tier-1 copy ('for a brief period of time', de-em-dashed).
- 02 chrome badge: clean conversation surface (no dev tooling).
- 03 privacy modal: current privacy copy.
- 04 lead-capture form: submission-as-consent — no marketing tickbox, no separate consent checkbox (matches D-3.2.1/D-3.2.2).
Regenerated swoop-legal-review-pack.docx to embed them.

Co-Authored-By: Claude Opus 4.8 <noreply@anthropic.com>
</commit_message>
<xml_diff>
--- a/planning/swoop-legal-review-pack.docx
+++ b/planning/swoop-legal-review-pack.docx
@@ -1639,7 +1639,7 @@
       <w:r>
         <w:drawing>
           <wp:inline>
-            <wp:extent cx="3657600" cy="5486400"/>
+            <wp:extent cx="3657600" cy="5573485"/>
             <wp:effectExtent b="0" l="0" r="0" t="0"/>
             <wp:docPr descr="Opening screen. Tier-1 disclosure plus consent. Layout shown for context; the copy in §4.1 is what counsel reviews." title="" id="20" name="Picture"/>
             <a:graphic>
@@ -1660,7 +1660,7 @@
                   <pic:spPr bwMode="auto">
                     <a:xfrm>
                       <a:off x="0" y="0"/>
-                      <a:ext cx="3657600" cy="5486400"/>
+                      <a:ext cx="3657600" cy="5573485"/>
                     </a:xfrm>
                     <a:prstGeom prst="rect">
                       <a:avLst/>
@@ -1694,7 +1694,7 @@
       <w:r>
         <w:drawing>
           <wp:inline>
-            <wp:extent cx="3657600" cy="6583680"/>
+            <wp:extent cx="3657600" cy="3831771"/>
             <wp:effectExtent b="0" l="0" r="0" t="0"/>
             <wp:docPr descr="Persistent chrome badge, visible throughout a conversation. Copy in §4.2 is what counsel reviews." title="" id="23" name="Picture"/>
             <a:graphic>
@@ -1715,7 +1715,7 @@
                   <pic:spPr bwMode="auto">
                     <a:xfrm>
                       <a:off x="0" y="0"/>
-                      <a:ext cx="3657600" cy="6583680"/>
+                      <a:ext cx="3657600" cy="3831771"/>
                     </a:xfrm>
                     <a:prstGeom prst="rect">
                       <a:avLst/>
@@ -1749,7 +1749,7 @@
       <w:r>
         <w:drawing>
           <wp:inline>
-            <wp:extent cx="3657600" cy="4702628"/>
+            <wp:extent cx="3657600" cy="3619892"/>
             <wp:effectExtent b="0" l="0" r="0" t="0"/>
             <wp:docPr descr="Privacy info modal. Copy in §4.3 is what counsel reviews. privacy@example.com is a literal placeholder pending D-3.3.3." title="" id="26" name="Picture"/>
             <a:graphic>
@@ -1770,7 +1770,7 @@
                   <pic:spPr bwMode="auto">
                     <a:xfrm>
                       <a:off x="0" y="0"/>
-                      <a:ext cx="3657600" cy="4702628"/>
+                      <a:ext cx="3657600" cy="3619892"/>
                     </a:xfrm>
                     <a:prstGeom prst="rect">
                       <a:avLst/>
@@ -1819,7 +1819,7 @@
       <w:r>
         <w:drawing>
           <wp:inline>
-            <wp:extent cx="3657600" cy="10241280"/>
+            <wp:extent cx="3657600" cy="5920032"/>
             <wp:effectExtent b="0" l="0" r="0" t="0"/>
             <wp:docPr descr="Lead-capture form, captured during a real qualified-handoff flow. Copy in §4.4 is what counsel reviews." title="" id="29" name="Picture"/>
             <a:graphic>
@@ -1840,7 +1840,7 @@
                   <pic:spPr bwMode="auto">
                     <a:xfrm>
                       <a:off x="0" y="0"/>
-                      <a:ext cx="3657600" cy="10241280"/>
+                      <a:ext cx="3657600" cy="5920032"/>
                     </a:xfrm>
                     <a:prstGeom prst="rect">
                       <a:avLst/>

</xml_diff>